<commit_message>
Refine tailored CV evidence, role focus and contact hyperlinks
</commit_message>
<xml_diff>
--- a/tailored-cvs/01_DHL_AI_Engineer.docx
+++ b/tailored-cvs/01_DHL_AI_Engineer.docx
@@ -24,8 +24,43 @@
         <w:rPr>
           <w:sz w:val="17"/>
         </w:rPr>
-        <w:t>Selangor, Malaysia | +60 11-5169 2338 | abdulhakimshaon7@gmail.com</w:t>
+        <w:t xml:space="preserve">Selangor, Malaysia | +60 11-5169 2338 | </w:t>
       </w:r>
+      <w:hyperlink r:id="rId9">
+        <w:r>
+          <w:rPr>
+            <w:color w:val="254F72"/>
+          </w:rPr>
+          <w:t>abdulhakimshaon7@gmail.com</w:t>
+        </w:r>
+      </w:hyperlink>
+    </w:p>
+    <w:p>
+      <w:pPr>
+        <w:spacing w:line="240" w:lineRule="auto"/>
+      </w:pPr>
+      <w:hyperlink r:id="rId10">
+        <w:r>
+          <w:rPr>
+            <w:color w:val="254F72"/>
+          </w:rPr>
+          <w:t>linkedin.com/in/abdul-hakim-shaon-185817357</w:t>
+        </w:r>
+      </w:hyperlink>
+      <w:r>
+        <w:rPr>
+          <w:sz w:val="17"/>
+        </w:rPr>
+        <w:t xml:space="preserve"> | </w:t>
+      </w:r>
+      <w:hyperlink r:id="rId11">
+        <w:r>
+          <w:rPr>
+            <w:color w:val="254F72"/>
+          </w:rPr>
+          <w:t>github.com/abdulhakimshaon7-hash</w:t>
+        </w:r>
+      </w:hyperlink>
     </w:p>
     <w:p>
       <w:pPr>
@@ -35,18 +70,7 @@
         <w:rPr>
           <w:sz w:val="17"/>
         </w:rPr>
-        <w:t>linkedin.com/in/abdul-hakim-shaon-185817357</w:t>
-      </w:r>
-    </w:p>
-    <w:p>
-      <w:pPr>
-        <w:spacing w:line="240" w:lineRule="auto"/>
-      </w:pPr>
-      <w:r>
-        <w:rPr>
-          <w:sz w:val="17"/>
-        </w:rPr>
-        <w:t>Available from November 2026 | 3- or 6-month internship</w:t>
+        <w:t>Available from November 2026 | 3-month internship (up to 6 months)</w:t>
       </w:r>
     </w:p>
     <w:p>
@@ -168,12 +192,14 @@
       <w:pPr>
         <w:spacing w:line="240" w:lineRule="auto"/>
       </w:pPr>
-      <w:r>
-        <w:rPr>
-          <w:sz w:val="17"/>
-        </w:rPr>
-        <w:t>github.com/abdulhakimshaon7-hash/LaporKita-AI</w:t>
-      </w:r>
+      <w:hyperlink r:id="rId12">
+        <w:r>
+          <w:rPr>
+            <w:color w:val="254F72"/>
+          </w:rPr>
+          <w:t>github.com/abdulhakimshaon7-hash/LaporKita-AI</w:t>
+        </w:r>
+      </w:hyperlink>
     </w:p>
     <w:p>
       <w:pPr>
@@ -199,7 +225,7 @@
         <w:ind w:left="173" w:hanging="144"/>
       </w:pPr>
       <w:r>
-        <w:t>• Implemented category-based keyword similarity grouping and alert workflows to help surface related community complaints.</w:t>
+        <w:t>• Evaluated 94 labeled test records: saved results show 81.9% exact category agreement and 78.7% exact urgency agreement.</w:t>
       </w:r>
     </w:p>
     <w:p>
@@ -211,7 +237,7 @@
         <w:rPr>
           <w:b/>
         </w:rPr>
-        <w:t>Student Performance Classification &amp; Retail Clustering | Academic Project</w:t>
+        <w:t>Student Performance Classification &amp; Retail Clustering | Academic Project | 2025</w:t>
       </w:r>
     </w:p>
     <w:p>
@@ -229,7 +255,7 @@
         <w:ind w:left="173" w:hanging="144"/>
       </w:pPr>
       <w:r>
-        <w:t>• Compared SVM, decision tree and random forest models with a stratified train/test split, confusion matrices, precision, recall and F1 scores; excluded GPA from predictors to avoid target leakage.</w:t>
+        <w:t>• Compared SVM, decision tree and random forest classifiers on a stratified 630-record test set; saved results show 75.2%, 72.9% and 74.4% accuracy, respectively.</w:t>
       </w:r>
     </w:p>
     <w:p>
@@ -250,19 +276,21 @@
         <w:rPr>
           <w:b/>
         </w:rPr>
-        <w:t>Malaysia Palm Oil &amp; Forest-Loss Data Story | Academic Project</w:t>
+        <w:t>Malaysia Palm Oil &amp; Forest-Loss Data Story | Academic Project | 2026</w:t>
       </w:r>
     </w:p>
     <w:p>
       <w:pPr>
         <w:spacing w:line="240" w:lineRule="auto"/>
       </w:pPr>
-      <w:r>
-        <w:rPr>
-          <w:sz w:val="17"/>
-        </w:rPr>
-        <w:t>asha0310-star.github.io/35174714_DV2/</w:t>
-      </w:r>
+      <w:hyperlink r:id="rId13">
+        <w:r>
+          <w:rPr>
+            <w:color w:val="254F72"/>
+          </w:rPr>
+          <w:t>asha0310-star.github.io/35174714_DV2/</w:t>
+        </w:r>
+      </w:hyperlink>
     </w:p>
     <w:p>
       <w:pPr>
@@ -288,7 +316,7 @@
         <w:ind w:left="173" w:hanging="144"/>
       </w:pPr>
       <w:r>
-        <w:t>• Created indexed trends and state comparisons with annotations, tooltips and documented source limitations; published the project through GitHub Pages.</w:t>
+        <w:t>• Compared indexed production and planted-area trends and state tree-cover-loss patterns; documented that tree-cover loss is not equivalent to permanent deforestation or proof of palm-oil causation.</w:t>
       </w:r>
     </w:p>
     <w:p>
@@ -301,7 +329,7 @@
           <w:b/>
           <w:color w:val="18354A"/>
         </w:rPr>
-        <w:t>CERTIFICATIONS &amp; ACTIVITIES</w:t>
+        <w:t>CERTIFICATIONS</w:t>
       </w:r>
     </w:p>
     <w:p>
@@ -309,7 +337,7 @@
         <w:spacing w:line="240" w:lineRule="auto"/>
       </w:pPr>
       <w:r>
-        <w:t>Prompt Design in Vertex AI - Google Cloud | Fundamentals of Deep Learning - NVIDIA</w:t>
+        <w:t>Google Cloud - Prompt Design in Vertex AI</w:t>
       </w:r>
     </w:p>
     <w:p>
@@ -317,7 +345,7 @@
         <w:spacing w:line="240" w:lineRule="auto"/>
       </w:pPr>
       <w:r>
-        <w:t>KitaHack 2026 participant, Team SoulNet | Google Developer Groups on Campus, Monash University Malaysia</w:t>
+        <w:t>NVIDIA - Fundamentals of Deep Learning</w:t>
       </w:r>
     </w:p>
     <w:sectPr>

</xml_diff>

<commit_message>
Add confirmed TeaMWork virtual internship completion to all CVs
</commit_message>
<xml_diff>
--- a/tailored-cvs/01_DHL_AI_Engineer.docx
+++ b/tailored-cvs/01_DHL_AI_Engineer.docx
@@ -161,6 +161,39 @@
       </w:pPr>
       <w:r>
         <w:t>Visualization &amp; tools: Vega-Lite, Tableau, Matplotlib, Git, Jupyter Notebook</w:t>
+      </w:r>
+    </w:p>
+    <w:p>
+      <w:pPr>
+        <w:keepNext/>
+        <w:spacing w:line="240" w:lineRule="auto" w:before="160"/>
+      </w:pPr>
+      <w:r>
+        <w:rPr>
+          <w:b/>
+          <w:color w:val="18354A"/>
+        </w:rPr>
+        <w:t>VIRTUAL INTERNSHIP</w:t>
+      </w:r>
+    </w:p>
+    <w:p>
+      <w:pPr>
+        <w:keepNext/>
+        <w:spacing w:line="240" w:lineRule="auto" w:before="80"/>
+      </w:pPr>
+      <w:r>
+        <w:rPr>
+          <w:b/>
+        </w:rPr>
+        <w:t>TeaMWork Virtual Internship | In collaboration with Lightblue</w:t>
+      </w:r>
+    </w:p>
+    <w:p>
+      <w:pPr>
+        <w:spacing w:line="240" w:lineRule="auto"/>
+      </w:pPr>
+      <w:r>
+        <w:t>29 June - 24 July 2026 | Completed; certificate of participation awarded</w:t>
       </w:r>
     </w:p>
     <w:p>

</xml_diff>

<commit_message>
Add Lightblue hospitality sustainability project focus to CVs
</commit_message>
<xml_diff>
--- a/tailored-cvs/01_DHL_AI_Engineer.docx
+++ b/tailored-cvs/01_DHL_AI_Engineer.docx
@@ -194,6 +194,14 @@
       </w:pPr>
       <w:r>
         <w:t>29 June - 24 July 2026 | Completed; certificate of participation awarded</w:t>
+      </w:r>
+    </w:p>
+    <w:p>
+      <w:pPr>
+        <w:spacing w:line="240" w:lineRule="auto"/>
+      </w:pPr>
+      <w:r>
+        <w:t>Project focus: sustainability training gaps and food waste prevention in the hospitality industry.</w:t>
       </w:r>
     </w:p>
     <w:p>

</xml_diff>

<commit_message>
Clarify TeaMWork data analysis ownership and team contributions
</commit_message>
<xml_diff>
--- a/tailored-cvs/01_DHL_AI_Engineer.docx
+++ b/tailored-cvs/01_DHL_AI_Engineer.docx
@@ -201,7 +201,16 @@
         <w:spacing w:line="240" w:lineRule="auto"/>
       </w:pPr>
       <w:r>
-        <w:t>Project focus: sustainability training gaps and food waste prevention in the hospitality industry.</w:t>
+        <w:t>Project focus: sustainability training gaps and food waste prevention in hospitality.</w:t>
+      </w:r>
+    </w:p>
+    <w:p>
+      <w:pPr>
+        <w:spacing w:line="240" w:lineRule="auto"/>
+        <w:ind w:left="173" w:hanging="144"/>
+      </w:pPr>
+      <w:r>
+        <w:t>• Owned the project data analysis; contributed to literature and market research, interviews/surveys, recommendations, the final report and presentation.</w:t>
       </w:r>
     </w:p>
     <w:p>

</xml_diff>